<commit_message>
Hoofdmaatregelen niet scoren bij self-assessments.
Maak het scoren van hoofdmaatregelen onmogelijk bij maatregelen met submaatregelen.

Closes #952.
</commit_message>
<xml_diff>
--- a/docs/wip/Neutraal-Template-Niet-Functionele-Eisen.docx
+++ b/docs/wip/Neutraal-Template-Niet-Functionele-Eisen.docx
@@ -1062,7 +1062,7 @@
     </w:p>
     <w:p>
       <w:r>
-        <w:t>Versie wip, 04-03-2025</w:t>
+        <w:t>Versie wip, 21-03-2025</w:t>
       </w:r>
     </w:p>
     <w:p>
@@ -5732,7 +5732,7 @@
               <w:jc w:val="left"/>
             </w:pPr>
             <w:r>
-              <w:t>Axe-core 4.10.2 regels</w:t>
+              <w:t>Axe-core 4.10.3 regels</w:t>
             </w:r>
           </w:p>
         </w:tc>

</xml_diff>